<commit_message>
Added lesson 22 write-up documentation
</commit_message>
<xml_diff>
--- a/Electrical/Level 2 - 2365/22 - lessonTwentyTwo/WriteUp/Lesson 22 (Final lesson).docx
+++ b/Electrical/Level 2 - 2365/22 - lessonTwentyTwo/WriteUp/Lesson 22 (Final lesson).docx
@@ -14,7 +14,7 @@
     </w:p>
     <w:sdt>
       <w:sdtPr>
-        <w:id w:val="-1132662000"/>
+        <w:id w:val="163356665"/>
         <w:docPartObj>
           <w:docPartGallery w:val="Table of Contents"/>
           <w:docPartUnique w:val="1"/>
@@ -39,7 +39,7 @@
             <w:instrText xml:space="preserve"> TOC \h \u \z \t "Heading 1,1,Heading 2,2,Heading 3,3,Heading 4,4,Heading 5,5,Heading 6,6,"</w:instrText>
             <w:fldChar w:fldCharType="separate"/>
           </w:r>
-          <w:hyperlink w:anchor="_17aalcl08glq">
+          <w:hyperlink w:anchor="_kdbvqybtly2u">
             <w:r>
               <w:rPr>
                 <w:b w:val="1"/>
@@ -53,7 +53,7 @@
           </w:hyperlink>
           <w:r>
             <w:fldChar w:fldCharType="begin"/>
-            <w:instrText xml:space="preserve"> PAGEREF _17aalcl08glq \h </w:instrText>
+            <w:instrText xml:space="preserve"> PAGEREF _kdbvqybtly2u \h </w:instrText>
             <w:fldChar w:fldCharType="separate"/>
           </w:r>
           <w:r>
@@ -85,7 +85,7 @@
               <w:u w:val="none"/>
             </w:rPr>
           </w:pPr>
-          <w:hyperlink w:anchor="_mywk0hy455st">
+          <w:hyperlink w:anchor="_tcr8ebvjniwr">
             <w:r>
               <w:rPr>
                 <w:b w:val="1"/>
@@ -99,7 +99,7 @@
           </w:hyperlink>
           <w:r>
             <w:fldChar w:fldCharType="begin"/>
-            <w:instrText xml:space="preserve"> PAGEREF _mywk0hy455st \h </w:instrText>
+            <w:instrText xml:space="preserve"> PAGEREF _tcr8ebvjniwr \h </w:instrText>
             <w:fldChar w:fldCharType="separate"/>
           </w:r>
           <w:r>
@@ -131,7 +131,7 @@
               <w:u w:val="none"/>
             </w:rPr>
           </w:pPr>
-          <w:hyperlink w:anchor="_pvt0k9e29tqh">
+          <w:hyperlink w:anchor="_gchmr3xur4p9">
             <w:r>
               <w:rPr>
                 <w:b w:val="1"/>
@@ -145,7 +145,7 @@
           </w:hyperlink>
           <w:r>
             <w:fldChar w:fldCharType="begin"/>
-            <w:instrText xml:space="preserve"> PAGEREF _pvt0k9e29tqh \h </w:instrText>
+            <w:instrText xml:space="preserve"> PAGEREF _gchmr3xur4p9 \h </w:instrText>
             <w:fldChar w:fldCharType="separate"/>
           </w:r>
           <w:r>
@@ -177,7 +177,7 @@
               <w:u w:val="none"/>
             </w:rPr>
           </w:pPr>
-          <w:hyperlink w:anchor="_3iw3p4p8mmiy">
+          <w:hyperlink w:anchor="_lzl18vc62n47">
             <w:r>
               <w:rPr>
                 <w:b w:val="1"/>
@@ -191,7 +191,7 @@
           </w:hyperlink>
           <w:r>
             <w:fldChar w:fldCharType="begin"/>
-            <w:instrText xml:space="preserve"> PAGEREF _3iw3p4p8mmiy \h </w:instrText>
+            <w:instrText xml:space="preserve"> PAGEREF _lzl18vc62n47 \h </w:instrText>
             <w:fldChar w:fldCharType="separate"/>
           </w:r>
           <w:r>
@@ -223,7 +223,7 @@
               <w:u w:val="none"/>
             </w:rPr>
           </w:pPr>
-          <w:hyperlink w:anchor="_84kgndjo7icm">
+          <w:hyperlink w:anchor="_cl319lvcezl9">
             <w:r>
               <w:rPr>
                 <w:b w:val="1"/>
@@ -237,7 +237,7 @@
           </w:hyperlink>
           <w:r>
             <w:fldChar w:fldCharType="begin"/>
-            <w:instrText xml:space="preserve"> PAGEREF _84kgndjo7icm \h </w:instrText>
+            <w:instrText xml:space="preserve"> PAGEREF _cl319lvcezl9 \h </w:instrText>
             <w:fldChar w:fldCharType="separate"/>
           </w:r>
           <w:r>
@@ -269,7 +269,7 @@
               <w:u w:val="none"/>
             </w:rPr>
           </w:pPr>
-          <w:hyperlink w:anchor="_7dklnazgm8sy">
+          <w:hyperlink w:anchor="_w9fjh3i82d">
             <w:r>
               <w:rPr>
                 <w:b w:val="1"/>
@@ -283,7 +283,7 @@
           </w:hyperlink>
           <w:r>
             <w:fldChar w:fldCharType="begin"/>
-            <w:instrText xml:space="preserve"> PAGEREF _7dklnazgm8sy \h </w:instrText>
+            <w:instrText xml:space="preserve"> PAGEREF _w9fjh3i82d \h </w:instrText>
             <w:fldChar w:fldCharType="separate"/>
           </w:r>
           <w:r>
@@ -352,7 +352,7 @@
         <w:pStyle w:val="Heading1"/>
         <w:rPr/>
       </w:pPr>
-      <w:bookmarkStart w:colFirst="0" w:colLast="0" w:name="_17aalcl08glq" w:id="0"/>
+      <w:bookmarkStart w:colFirst="0" w:colLast="0" w:name="_kdbvqybtly2u" w:id="0"/>
       <w:bookmarkEnd w:id="0"/>
       <w:r>
         <w:rPr>
@@ -379,7 +379,7 @@
         <w:rPr>
           <w:rtl w:val="0"/>
         </w:rPr>
-        <w:t xml:space="preserve">The overall schematic for the circuit board that I my cohorts and I had to installation as part of the final assessment for the 2365 level 2 diploma. </w:t>
+        <w:t xml:space="preserve">The overall schematic for the circuit board that my cohorts and I had to install as part of the final assessment for the 2365 level 2 diploma. </w:t>
       </w:r>
     </w:p>
     <w:p>
@@ -422,7 +422,7 @@
           <wp:inline distB="114300" distT="114300" distL="114300" distR="114300">
             <wp:extent cx="4720961" cy="3548537"/>
             <wp:effectExtent b="38100" l="38100" r="38100" t="38100"/>
-            <wp:docPr id="4" name="image1.png"/>
+            <wp:docPr id="2" name="image1.png"/>
             <a:graphic>
               <a:graphicData uri="http://schemas.openxmlformats.org/drawingml/2006/picture">
                 <pic:pic>
@@ -527,7 +527,7 @@
         <w:pStyle w:val="Heading1"/>
         <w:rPr/>
       </w:pPr>
-      <w:bookmarkStart w:colFirst="0" w:colLast="0" w:name="_mywk0hy455st" w:id="1"/>
+      <w:bookmarkStart w:colFirst="0" w:colLast="0" w:name="_tcr8ebvjniwr" w:id="1"/>
       <w:bookmarkEnd w:id="1"/>
       <w:r>
         <w:rPr>
@@ -611,12 +611,12 @@
           <wp:inline distB="114300" distT="114300" distL="114300" distR="114300">
             <wp:extent cx="2985016" cy="2457588"/>
             <wp:effectExtent b="25400" l="25400" r="25400" t="25400"/>
-            <wp:docPr id="1" name="image4.png"/>
+            <wp:docPr id="5" name="image7.png"/>
             <a:graphic>
               <a:graphicData uri="http://schemas.openxmlformats.org/drawingml/2006/picture">
                 <pic:pic>
                   <pic:nvPicPr>
-                    <pic:cNvPr id="0" name="image4.png"/>
+                    <pic:cNvPr id="0" name="image7.png"/>
                     <pic:cNvPicPr preferRelativeResize="0"/>
                   </pic:nvPicPr>
                   <pic:blipFill>
@@ -705,12 +705,12 @@
           <wp:inline distB="114300" distT="114300" distL="114300" distR="114300">
             <wp:extent cx="2994117" cy="2786887"/>
             <wp:effectExtent b="25400" l="25400" r="25400" t="25400"/>
-            <wp:docPr id="2" name="image3.png"/>
+            <wp:docPr id="4" name="image4.png"/>
             <a:graphic>
               <a:graphicData uri="http://schemas.openxmlformats.org/drawingml/2006/picture">
                 <pic:pic>
                   <pic:nvPicPr>
-                    <pic:cNvPr id="0" name="image3.png"/>
+                    <pic:cNvPr id="0" name="image4.png"/>
                     <pic:cNvPicPr preferRelativeResize="0"/>
                   </pic:nvPicPr>
                   <pic:blipFill>
@@ -777,6 +777,36 @@
     </w:p>
     <w:p>
       <w:pPr>
+        <w:rPr/>
+      </w:pPr>
+      <w:r>
+        <w:rPr>
+          <w:rtl w:val="0"/>
+        </w:rPr>
+      </w:r>
+    </w:p>
+    <w:p>
+      <w:pPr>
+        <w:rPr/>
+      </w:pPr>
+      <w:r>
+        <w:rPr>
+          <w:rtl w:val="0"/>
+        </w:rPr>
+      </w:r>
+    </w:p>
+    <w:p>
+      <w:pPr>
+        <w:rPr/>
+      </w:pPr>
+      <w:r>
+        <w:rPr>
+          <w:rtl w:val="0"/>
+        </w:rPr>
+      </w:r>
+    </w:p>
+    <w:p>
+      <w:pPr>
         <w:rPr>
           <w:b w:val="1"/>
         </w:rPr>
@@ -799,12 +829,12 @@
           <wp:inline distB="114300" distT="114300" distL="114300" distR="114300">
             <wp:extent cx="4281488" cy="3975667"/>
             <wp:effectExtent b="25400" l="25400" r="25400" t="25400"/>
-            <wp:docPr id="5" name="image2.png"/>
+            <wp:docPr id="8" name="image3.png"/>
             <a:graphic>
               <a:graphicData uri="http://schemas.openxmlformats.org/drawingml/2006/picture">
                 <pic:pic>
                   <pic:nvPicPr>
-                    <pic:cNvPr id="0" name="image2.png"/>
+                    <pic:cNvPr id="0" name="image3.png"/>
                     <pic:cNvPicPr preferRelativeResize="0"/>
                   </pic:nvPicPr>
                   <pic:blipFill>
@@ -881,7 +911,7 @@
         <w:spacing w:after="0" w:before="0" w:lineRule="auto"/>
         <w:rPr/>
       </w:pPr>
-      <w:bookmarkStart w:colFirst="0" w:colLast="0" w:name="_tch0r1ebmdl8" w:id="2"/>
+      <w:bookmarkStart w:colFirst="0" w:colLast="0" w:name="_y9c3ip5tq40a" w:id="2"/>
       <w:bookmarkEnd w:id="2"/>
       <w:r>
         <w:rPr>
@@ -894,12 +924,12 @@
           <wp:inline distB="114300" distT="114300" distL="114300" distR="114300">
             <wp:extent cx="3614738" cy="2985741"/>
             <wp:effectExtent b="25400" l="25400" r="25400" t="25400"/>
-            <wp:docPr id="3" name="image5.png"/>
+            <wp:docPr id="6" name="image2.png"/>
             <a:graphic>
               <a:graphicData uri="http://schemas.openxmlformats.org/drawingml/2006/picture">
                 <pic:pic>
                   <pic:nvPicPr>
-                    <pic:cNvPr id="0" name="image5.png"/>
+                    <pic:cNvPr id="0" name="image2.png"/>
                     <pic:cNvPicPr preferRelativeResize="0"/>
                   </pic:nvPicPr>
                   <pic:blipFill>
@@ -1001,7 +1031,7 @@
         <w:pStyle w:val="Heading1"/>
         <w:rPr/>
       </w:pPr>
-      <w:bookmarkStart w:colFirst="0" w:colLast="0" w:name="_y2tz3hcim5mz" w:id="3"/>
+      <w:bookmarkStart w:colFirst="0" w:colLast="0" w:name="_yuyqc71m4t5q" w:id="3"/>
       <w:bookmarkEnd w:id="3"/>
       <w:r>
         <w:rPr>
@@ -1014,7 +1044,7 @@
         <w:pStyle w:val="Heading1"/>
         <w:rPr/>
       </w:pPr>
-      <w:bookmarkStart w:colFirst="0" w:colLast="0" w:name="_84kgndjo7icm" w:id="4"/>
+      <w:bookmarkStart w:colFirst="0" w:colLast="0" w:name="_cl319lvcezl9" w:id="4"/>
       <w:bookmarkEnd w:id="4"/>
       <w:r>
         <w:rPr>
@@ -1043,11 +1073,6 @@
         </w:rPr>
         <w:t xml:space="preserve">Is on a 32 amp breaker.</w:t>
       </w:r>
-      <w:r>
-        <w:rPr>
-          <w:rtl w:val="0"/>
-        </w:rPr>
-      </w:r>
     </w:p>
     <w:p>
       <w:pPr>
@@ -1058,6 +1083,1225 @@
           <w:rtl w:val="0"/>
         </w:rPr>
         <w:t xml:space="preserve">The ring circuit as long as you have 2 blue 2 brown and 2 green at every point that means you will have the same at the fuse board both L and N both connected to the breaker and green to earth.</w:t>
+        <w:br w:type="textWrapping"/>
+        <w:br w:type="textWrapping"/>
+        <w:t xml:space="preserve">For the running coupler part. There are three things to consider.</w:t>
+      </w:r>
+    </w:p>
+    <w:p>
+      <w:pPr>
+        <w:rPr/>
+      </w:pPr>
+      <w:r>
+        <w:rPr>
+          <w:rtl w:val="0"/>
+        </w:rPr>
+      </w:r>
+    </w:p>
+    <w:p>
+      <w:pPr>
+        <w:rPr>
+          <w:b w:val="1"/>
+          <w:u w:val="single"/>
+        </w:rPr>
+      </w:pPr>
+      <w:r>
+        <w:rPr>
+          <w:b w:val="1"/>
+          <w:u w:val="single"/>
+          <w:rtl w:val="0"/>
+        </w:rPr>
+        <w:t xml:space="preserve">First step</w:t>
+      </w:r>
+    </w:p>
+    <w:p>
+      <w:pPr>
+        <w:rPr/>
+      </w:pPr>
+      <w:r>
+        <w:rPr>
+          <w:rtl w:val="0"/>
+        </w:rPr>
+      </w:r>
+    </w:p>
+    <w:p>
+      <w:pPr>
+        <w:rPr/>
+      </w:pPr>
+      <w:r>
+        <w:rPr/>
+        <w:drawing>
+          <wp:inline distB="114300" distT="114300" distL="114300" distR="114300">
+            <wp:extent cx="5731200" cy="1524000"/>
+            <wp:effectExtent b="25400" l="25400" r="25400" t="25400"/>
+            <wp:docPr id="1" name="image8.png"/>
+            <a:graphic>
+              <a:graphicData uri="http://schemas.openxmlformats.org/drawingml/2006/picture">
+                <pic:pic>
+                  <pic:nvPicPr>
+                    <pic:cNvPr id="0" name="image8.png"/>
+                    <pic:cNvPicPr preferRelativeResize="0"/>
+                  </pic:nvPicPr>
+                  <pic:blipFill>
+                    <a:blip r:embed="rId11"/>
+                    <a:srcRect b="0" l="0" r="0" t="0"/>
+                    <a:stretch>
+                      <a:fillRect/>
+                    </a:stretch>
+                  </pic:blipFill>
+                  <pic:spPr>
+                    <a:xfrm>
+                      <a:off x="0" y="0"/>
+                      <a:ext cx="5731200" cy="1524000"/>
+                    </a:xfrm>
+                    <a:prstGeom prst="rect"/>
+                    <a:ln w="25400">
+                      <a:solidFill>
+                        <a:srgbClr val="000000"/>
+                      </a:solidFill>
+                      <a:prstDash val="solid"/>
+                    </a:ln>
+                  </pic:spPr>
+                </pic:pic>
+              </a:graphicData>
+            </a:graphic>
+          </wp:inline>
+        </w:drawing>
+      </w:r>
+      <w:r>
+        <w:rPr>
+          <w:rtl w:val="0"/>
+        </w:rPr>
+      </w:r>
+    </w:p>
+    <w:p>
+      <w:pPr>
+        <w:rPr/>
+      </w:pPr>
+      <w:r>
+        <w:rPr>
+          <w:rtl w:val="0"/>
+        </w:rPr>
+      </w:r>
+    </w:p>
+    <w:p>
+      <w:pPr>
+        <w:rPr/>
+      </w:pPr>
+      <w:r>
+        <w:rPr>
+          <w:rtl w:val="0"/>
+        </w:rPr>
+        <w:t xml:space="preserve">The first thing to do is to measure the length from the tip of the </w:t>
+      </w:r>
+      <w:r>
+        <w:rPr>
+          <w:b w:val="1"/>
+          <w:color w:val="1155cc"/>
+          <w:rtl w:val="0"/>
+        </w:rPr>
+        <w:t xml:space="preserve">conduit angle box one</w:t>
+      </w:r>
+      <w:r>
+        <w:rPr>
+          <w:rtl w:val="0"/>
+        </w:rPr>
+        <w:t xml:space="preserve"> to </w:t>
+      </w:r>
+      <w:r>
+        <w:rPr>
+          <w:b w:val="1"/>
+          <w:color w:val="1155cc"/>
+          <w:rtl w:val="0"/>
+        </w:rPr>
+        <w:t xml:space="preserve">conduit angle box two</w:t>
+      </w:r>
+      <w:r>
+        <w:rPr>
+          <w:rtl w:val="0"/>
+        </w:rPr>
+        <w:t xml:space="preserve">. Indicated in </w:t>
+      </w:r>
+      <w:r>
+        <w:rPr>
+          <w:b w:val="1"/>
+          <w:color w:val="ff0000"/>
+          <w:rtl w:val="0"/>
+        </w:rPr>
+        <w:t xml:space="preserve">red </w:t>
+      </w:r>
+      <w:r>
+        <w:rPr>
+          <w:rtl w:val="0"/>
+        </w:rPr>
+        <w:t xml:space="preserve">above.</w:t>
+      </w:r>
+    </w:p>
+    <w:p>
+      <w:pPr>
+        <w:rPr/>
+      </w:pPr>
+      <w:r>
+        <w:rPr>
+          <w:rtl w:val="0"/>
+        </w:rPr>
+      </w:r>
+    </w:p>
+    <w:p>
+      <w:pPr>
+        <w:rPr/>
+      </w:pPr>
+      <w:r>
+        <w:rPr>
+          <w:rtl w:val="0"/>
+        </w:rPr>
+      </w:r>
+    </w:p>
+    <w:p>
+      <w:pPr>
+        <w:rPr>
+          <w:b w:val="1"/>
+          <w:u w:val="single"/>
+        </w:rPr>
+      </w:pPr>
+      <w:r>
+        <w:rPr>
+          <w:b w:val="1"/>
+          <w:u w:val="single"/>
+          <w:rtl w:val="0"/>
+        </w:rPr>
+        <w:t xml:space="preserve">Second step</w:t>
+      </w:r>
+    </w:p>
+    <w:p>
+      <w:pPr>
+        <w:rPr>
+          <w:b w:val="1"/>
+          <w:u w:val="single"/>
+        </w:rPr>
+      </w:pPr>
+      <w:r>
+        <w:rPr>
+          <w:rtl w:val="0"/>
+        </w:rPr>
+      </w:r>
+    </w:p>
+    <w:p>
+      <w:pPr>
+        <w:rPr/>
+      </w:pPr>
+      <w:r>
+        <w:rPr>
+          <w:rtl w:val="0"/>
+        </w:rPr>
+        <w:t xml:space="preserve">For the</w:t>
+      </w:r>
+      <w:r>
+        <w:rPr>
+          <w:b w:val="1"/>
+          <w:color w:val="1155cc"/>
+          <w:rtl w:val="0"/>
+        </w:rPr>
+        <w:t xml:space="preserve"> conduit angle box two</w:t>
+      </w:r>
+      <w:r>
+        <w:rPr>
+          <w:rtl w:val="0"/>
+        </w:rPr>
+        <w:t xml:space="preserve"> insert a </w:t>
+      </w:r>
+      <w:r>
+        <w:rPr>
+          <w:b w:val="1"/>
+          <w:color w:val="ff9900"/>
+          <w:rtl w:val="0"/>
+        </w:rPr>
+        <w:t xml:space="preserve">nipple </w:t>
+      </w:r>
+      <w:r>
+        <w:rPr>
+          <w:rtl w:val="0"/>
+        </w:rPr>
+        <w:t xml:space="preserve">(which is a threaded coupler, where the threads are on the external). See the below makeshift image. </w:t>
+      </w:r>
+    </w:p>
+    <w:p>
+      <w:pPr>
+        <w:rPr/>
+      </w:pPr>
+      <w:r>
+        <w:rPr>
+          <w:rtl w:val="0"/>
+        </w:rPr>
+      </w:r>
+    </w:p>
+    <w:p>
+      <w:pPr>
+        <w:rPr/>
+      </w:pPr>
+      <w:r>
+        <w:rPr>
+          <w:rtl w:val="0"/>
+        </w:rPr>
+        <w:t xml:space="preserve">The length of the </w:t>
+      </w:r>
+      <w:r>
+        <w:rPr>
+          <w:b w:val="1"/>
+          <w:color w:val="ff9900"/>
+          <w:rtl w:val="0"/>
+        </w:rPr>
+        <w:t xml:space="preserve">nipple </w:t>
+      </w:r>
+      <w:r>
+        <w:rPr>
+          <w:rtl w:val="0"/>
+        </w:rPr>
+        <w:t xml:space="preserve">is has to meet two criteria:</w:t>
+      </w:r>
+    </w:p>
+    <w:p>
+      <w:pPr>
+        <w:numPr>
+          <w:ilvl w:val="0"/>
+          <w:numId w:val="1"/>
+        </w:numPr>
+        <w:ind w:left="720" w:hanging="360"/>
+        <w:rPr>
+          <w:u w:val="none"/>
+        </w:rPr>
+      </w:pPr>
+      <w:r>
+        <w:rPr>
+          <w:rtl w:val="0"/>
+        </w:rPr>
+        <w:t xml:space="preserve">First the </w:t>
+      </w:r>
+      <w:r>
+        <w:rPr>
+          <w:b w:val="1"/>
+          <w:color w:val="ff9900"/>
+          <w:rtl w:val="0"/>
+        </w:rPr>
+        <w:t xml:space="preserve">nipple</w:t>
+      </w:r>
+      <w:r>
+        <w:rPr>
+          <w:rtl w:val="0"/>
+        </w:rPr>
+        <w:t xml:space="preserve"> has to be long enough to screw all the way into the </w:t>
+      </w:r>
+      <w:r>
+        <w:rPr>
+          <w:b w:val="1"/>
+          <w:color w:val="1155cc"/>
+          <w:rtl w:val="0"/>
+        </w:rPr>
+        <w:t xml:space="preserve">conduit angle box two</w:t>
+      </w:r>
+      <w:r>
+        <w:rPr>
+          <w:rtl w:val="0"/>
+        </w:rPr>
+        <w:t xml:space="preserve">;</w:t>
+      </w:r>
+    </w:p>
+    <w:p>
+      <w:pPr>
+        <w:numPr>
+          <w:ilvl w:val="0"/>
+          <w:numId w:val="1"/>
+        </w:numPr>
+        <w:ind w:left="720" w:hanging="360"/>
+        <w:rPr>
+          <w:u w:val="none"/>
+        </w:rPr>
+      </w:pPr>
+      <w:r>
+        <w:rPr>
+          <w:rtl w:val="0"/>
+        </w:rPr>
+        <w:t xml:space="preserve">Secondly, the remainder that sticks out of </w:t>
+      </w:r>
+      <w:r>
+        <w:rPr>
+          <w:b w:val="1"/>
+          <w:color w:val="1155cc"/>
+          <w:rtl w:val="0"/>
+        </w:rPr>
+        <w:t xml:space="preserve">conduit angle box two</w:t>
+      </w:r>
+      <w:r>
+        <w:rPr>
+          <w:rtl w:val="0"/>
+        </w:rPr>
+        <w:t xml:space="preserve"> has to be equivalent to the length of half a coupler.</w:t>
+      </w:r>
+    </w:p>
+    <w:p>
+      <w:pPr>
+        <w:rPr/>
+      </w:pPr>
+      <w:r>
+        <w:rPr/>
+        <w:drawing>
+          <wp:inline distB="114300" distT="114300" distL="114300" distR="114300">
+            <wp:extent cx="5731200" cy="2324100"/>
+            <wp:effectExtent b="38100" l="38100" r="38100" t="38100"/>
+            <wp:docPr id="3" name="image5.png"/>
+            <a:graphic>
+              <a:graphicData uri="http://schemas.openxmlformats.org/drawingml/2006/picture">
+                <pic:pic>
+                  <pic:nvPicPr>
+                    <pic:cNvPr id="0" name="image5.png"/>
+                    <pic:cNvPicPr preferRelativeResize="0"/>
+                  </pic:nvPicPr>
+                  <pic:blipFill>
+                    <a:blip r:embed="rId12"/>
+                    <a:srcRect b="0" l="0" r="0" t="0"/>
+                    <a:stretch>
+                      <a:fillRect/>
+                    </a:stretch>
+                  </pic:blipFill>
+                  <pic:spPr>
+                    <a:xfrm>
+                      <a:off x="0" y="0"/>
+                      <a:ext cx="5731200" cy="2324100"/>
+                    </a:xfrm>
+                    <a:prstGeom prst="rect"/>
+                    <a:ln w="38100">
+                      <a:solidFill>
+                        <a:srgbClr val="000000"/>
+                      </a:solidFill>
+                      <a:prstDash val="solid"/>
+                    </a:ln>
+                  </pic:spPr>
+                </pic:pic>
+              </a:graphicData>
+            </a:graphic>
+          </wp:inline>
+        </w:drawing>
+      </w:r>
+      <w:r>
+        <w:rPr>
+          <w:rtl w:val="0"/>
+        </w:rPr>
+      </w:r>
+    </w:p>
+    <w:p>
+      <w:pPr>
+        <w:rPr/>
+      </w:pPr>
+      <w:r>
+        <w:rPr>
+          <w:rtl w:val="0"/>
+        </w:rPr>
+      </w:r>
+    </w:p>
+    <w:p>
+      <w:pPr>
+        <w:rPr/>
+      </w:pPr>
+      <w:r>
+        <w:rPr>
+          <w:rtl w:val="0"/>
+        </w:rPr>
+      </w:r>
+    </w:p>
+    <w:p>
+      <w:pPr>
+        <w:rPr/>
+      </w:pPr>
+      <w:r>
+        <w:rPr>
+          <w:rtl w:val="0"/>
+        </w:rPr>
+      </w:r>
+    </w:p>
+    <w:p>
+      <w:pPr>
+        <w:rPr/>
+      </w:pPr>
+      <w:r>
+        <w:rPr>
+          <w:rtl w:val="0"/>
+        </w:rPr>
+      </w:r>
+    </w:p>
+    <w:p>
+      <w:pPr>
+        <w:rPr/>
+      </w:pPr>
+      <w:r>
+        <w:rPr>
+          <w:rtl w:val="0"/>
+        </w:rPr>
+      </w:r>
+    </w:p>
+    <w:p>
+      <w:pPr>
+        <w:rPr>
+          <w:b w:val="1"/>
+          <w:u w:val="single"/>
+        </w:rPr>
+      </w:pPr>
+      <w:r>
+        <w:rPr>
+          <w:b w:val="1"/>
+          <w:u w:val="single"/>
+          <w:rtl w:val="0"/>
+        </w:rPr>
+        <w:t xml:space="preserve">Third step</w:t>
+      </w:r>
+    </w:p>
+    <w:p>
+      <w:pPr>
+        <w:rPr/>
+      </w:pPr>
+      <w:r>
+        <w:rPr>
+          <w:rtl w:val="0"/>
+        </w:rPr>
+      </w:r>
+    </w:p>
+    <w:p>
+      <w:pPr>
+        <w:rPr/>
+      </w:pPr>
+      <w:r>
+        <w:rPr>
+          <w:b w:val="1"/>
+          <w:color w:val="1155cc"/>
+          <w:rtl w:val="0"/>
+        </w:rPr>
+        <w:t xml:space="preserve">conduit angle box one </w:t>
+      </w:r>
+      <w:r>
+        <w:rPr>
+          <w:b w:val="1"/>
+          <w:rtl w:val="0"/>
+        </w:rPr>
+        <w:t xml:space="preserve">side</w:t>
+      </w:r>
+      <w:r>
+        <w:rPr>
+          <w:rtl w:val="0"/>
+        </w:rPr>
+      </w:r>
+    </w:p>
+    <w:p>
+      <w:pPr>
+        <w:rPr/>
+      </w:pPr>
+      <w:r>
+        <w:rPr>
+          <w:rtl w:val="0"/>
+        </w:rPr>
+      </w:r>
+    </w:p>
+    <w:p>
+      <w:pPr>
+        <w:rPr/>
+      </w:pPr>
+      <w:r>
+        <w:rPr/>
+        <w:drawing>
+          <wp:inline distB="114300" distT="114300" distL="114300" distR="114300">
+            <wp:extent cx="5731200" cy="1447800"/>
+            <wp:effectExtent b="25400" l="25400" r="25400" t="25400"/>
+            <wp:docPr id="7" name="image6.png"/>
+            <a:graphic>
+              <a:graphicData uri="http://schemas.openxmlformats.org/drawingml/2006/picture">
+                <pic:pic>
+                  <pic:nvPicPr>
+                    <pic:cNvPr id="0" name="image6.png"/>
+                    <pic:cNvPicPr preferRelativeResize="0"/>
+                  </pic:nvPicPr>
+                  <pic:blipFill>
+                    <a:blip r:embed="rId13"/>
+                    <a:srcRect b="0" l="0" r="0" t="0"/>
+                    <a:stretch>
+                      <a:fillRect/>
+                    </a:stretch>
+                  </pic:blipFill>
+                  <pic:spPr>
+                    <a:xfrm>
+                      <a:off x="0" y="0"/>
+                      <a:ext cx="5731200" cy="1447800"/>
+                    </a:xfrm>
+                    <a:prstGeom prst="rect"/>
+                    <a:ln w="25400">
+                      <a:solidFill>
+                        <a:srgbClr val="000000"/>
+                      </a:solidFill>
+                      <a:prstDash val="solid"/>
+                    </a:ln>
+                  </pic:spPr>
+                </pic:pic>
+              </a:graphicData>
+            </a:graphic>
+          </wp:inline>
+        </w:drawing>
+      </w:r>
+      <w:r>
+        <w:rPr>
+          <w:rtl w:val="0"/>
+        </w:rPr>
+      </w:r>
+    </w:p>
+    <w:p>
+      <w:pPr>
+        <w:rPr/>
+      </w:pPr>
+      <w:r>
+        <w:rPr>
+          <w:rtl w:val="0"/>
+        </w:rPr>
+      </w:r>
+    </w:p>
+    <w:p>
+      <w:pPr>
+        <w:rPr/>
+      </w:pPr>
+      <w:r>
+        <w:rPr>
+          <w:rtl w:val="0"/>
+        </w:rPr>
+        <w:t xml:space="preserve">For the </w:t>
+      </w:r>
+      <w:r>
+        <w:rPr>
+          <w:b w:val="1"/>
+          <w:color w:val="1155cc"/>
+          <w:rtl w:val="0"/>
+        </w:rPr>
+        <w:t xml:space="preserve">conduit angle box one </w:t>
+      </w:r>
+      <w:r>
+        <w:rPr>
+          <w:rtl w:val="0"/>
+        </w:rPr>
+        <w:t xml:space="preserve">the </w:t>
+      </w:r>
+      <w:r>
+        <w:rPr>
+          <w:b w:val="1"/>
+          <w:color w:val="9900ff"/>
+          <w:rtl w:val="0"/>
+        </w:rPr>
+        <w:t xml:space="preserve">steel conduit </w:t>
+      </w:r>
+      <w:r>
+        <w:rPr>
+          <w:rtl w:val="0"/>
+        </w:rPr>
+        <w:t xml:space="preserve">a</w:t>
+      </w:r>
+      <w:r>
+        <w:rPr>
+          <w:rtl w:val="0"/>
+        </w:rPr>
+        <w:t xml:space="preserve">lready has a threaded end (on the side pointing into </w:t>
+      </w:r>
+      <w:r>
+        <w:rPr>
+          <w:b w:val="1"/>
+          <w:color w:val="1155cc"/>
+          <w:rtl w:val="0"/>
+        </w:rPr>
+        <w:t xml:space="preserve">conduit angle box one</w:t>
+      </w:r>
+      <w:r>
+        <w:rPr>
+          <w:rtl w:val="0"/>
+        </w:rPr>
+        <w:t xml:space="preserve">). Therefore, I did not need to apply an external thread. </w:t>
+      </w:r>
+    </w:p>
+    <w:p>
+      <w:pPr>
+        <w:rPr/>
+      </w:pPr>
+      <w:r>
+        <w:rPr>
+          <w:rtl w:val="0"/>
+        </w:rPr>
+      </w:r>
+    </w:p>
+    <w:p>
+      <w:pPr>
+        <w:rPr>
+          <w:b w:val="1"/>
+          <w:color w:val="1155cc"/>
+        </w:rPr>
+      </w:pPr>
+      <w:r>
+        <w:rPr>
+          <w:rtl w:val="0"/>
+        </w:rPr>
+        <w:t xml:space="preserve">However, you may need to apply an external thread if not present. The amount of thread that you apply to the end should approximately be half a coupler length. Screw this side of the </w:t>
+      </w:r>
+      <w:r>
+        <w:rPr>
+          <w:b w:val="1"/>
+          <w:color w:val="9900ff"/>
+          <w:rtl w:val="0"/>
+        </w:rPr>
+        <w:t xml:space="preserve">steel conduit</w:t>
+      </w:r>
+      <w:r>
+        <w:rPr>
+          <w:rtl w:val="0"/>
+        </w:rPr>
+        <w:t xml:space="preserve"> into </w:t>
+      </w:r>
+      <w:r>
+        <w:rPr>
+          <w:b w:val="1"/>
+          <w:color w:val="1155cc"/>
+          <w:rtl w:val="0"/>
+        </w:rPr>
+        <w:t xml:space="preserve">conduit angle box one.</w:t>
+      </w:r>
+    </w:p>
+    <w:p>
+      <w:pPr>
+        <w:rPr>
+          <w:b w:val="1"/>
+          <w:color w:val="1155cc"/>
+        </w:rPr>
+      </w:pPr>
+      <w:r>
+        <w:rPr>
+          <w:rtl w:val="0"/>
+        </w:rPr>
+      </w:r>
+    </w:p>
+    <w:p>
+      <w:pPr>
+        <w:rPr>
+          <w:b w:val="1"/>
+          <w:color w:val="1155cc"/>
+        </w:rPr>
+      </w:pPr>
+      <w:r>
+        <w:rPr>
+          <w:rtl w:val="0"/>
+        </w:rPr>
+      </w:r>
+    </w:p>
+    <w:p>
+      <w:pPr>
+        <w:rPr>
+          <w:b w:val="1"/>
+          <w:color w:val="1155cc"/>
+        </w:rPr>
+      </w:pPr>
+      <w:r>
+        <w:rPr>
+          <w:rtl w:val="0"/>
+        </w:rPr>
+      </w:r>
+    </w:p>
+    <w:p>
+      <w:pPr>
+        <w:rPr>
+          <w:b w:val="1"/>
+          <w:color w:val="1155cc"/>
+        </w:rPr>
+      </w:pPr>
+      <w:r>
+        <w:rPr>
+          <w:rtl w:val="0"/>
+        </w:rPr>
+      </w:r>
+    </w:p>
+    <w:p>
+      <w:pPr>
+        <w:rPr>
+          <w:b w:val="1"/>
+          <w:color w:val="1155cc"/>
+        </w:rPr>
+      </w:pPr>
+      <w:r>
+        <w:rPr>
+          <w:rtl w:val="0"/>
+        </w:rPr>
+      </w:r>
+    </w:p>
+    <w:p>
+      <w:pPr>
+        <w:rPr>
+          <w:b w:val="1"/>
+          <w:color w:val="1155cc"/>
+        </w:rPr>
+      </w:pPr>
+      <w:r>
+        <w:rPr>
+          <w:rtl w:val="0"/>
+        </w:rPr>
+      </w:r>
+    </w:p>
+    <w:p>
+      <w:pPr>
+        <w:rPr>
+          <w:b w:val="1"/>
+          <w:color w:val="1155cc"/>
+        </w:rPr>
+      </w:pPr>
+      <w:r>
+        <w:rPr>
+          <w:rtl w:val="0"/>
+        </w:rPr>
+      </w:r>
+    </w:p>
+    <w:p>
+      <w:pPr>
+        <w:rPr>
+          <w:b w:val="1"/>
+          <w:color w:val="1155cc"/>
+        </w:rPr>
+      </w:pPr>
+      <w:r>
+        <w:rPr>
+          <w:rtl w:val="0"/>
+        </w:rPr>
+      </w:r>
+    </w:p>
+    <w:p>
+      <w:pPr>
+        <w:rPr>
+          <w:b w:val="1"/>
+          <w:color w:val="1155cc"/>
+        </w:rPr>
+      </w:pPr>
+      <w:r>
+        <w:rPr>
+          <w:rtl w:val="0"/>
+        </w:rPr>
+      </w:r>
+    </w:p>
+    <w:p>
+      <w:pPr>
+        <w:rPr>
+          <w:b w:val="1"/>
+          <w:color w:val="1155cc"/>
+        </w:rPr>
+      </w:pPr>
+      <w:r>
+        <w:rPr>
+          <w:rtl w:val="0"/>
+        </w:rPr>
+      </w:r>
+    </w:p>
+    <w:p>
+      <w:pPr>
+        <w:rPr>
+          <w:b w:val="1"/>
+          <w:color w:val="1155cc"/>
+        </w:rPr>
+      </w:pPr>
+      <w:r>
+        <w:rPr>
+          <w:rtl w:val="0"/>
+        </w:rPr>
+      </w:r>
+    </w:p>
+    <w:p>
+      <w:pPr>
+        <w:rPr>
+          <w:b w:val="1"/>
+          <w:color w:val="1155cc"/>
+        </w:rPr>
+      </w:pPr>
+      <w:r>
+        <w:rPr>
+          <w:rtl w:val="0"/>
+        </w:rPr>
+      </w:r>
+    </w:p>
+    <w:p>
+      <w:pPr>
+        <w:rPr>
+          <w:b w:val="1"/>
+          <w:u w:val="single"/>
+        </w:rPr>
+      </w:pPr>
+      <w:r>
+        <w:rPr>
+          <w:b w:val="1"/>
+          <w:u w:val="single"/>
+          <w:rtl w:val="0"/>
+        </w:rPr>
+        <w:t xml:space="preserve">Fourth step</w:t>
+      </w:r>
+    </w:p>
+    <w:p>
+      <w:pPr>
+        <w:rPr>
+          <w:b w:val="1"/>
+          <w:u w:val="single"/>
+        </w:rPr>
+      </w:pPr>
+      <w:r>
+        <w:rPr>
+          <w:rtl w:val="0"/>
+        </w:rPr>
+      </w:r>
+    </w:p>
+    <w:p>
+      <w:pPr>
+        <w:rPr>
+          <w:b w:val="1"/>
+          <w:u w:val="single"/>
+        </w:rPr>
+      </w:pPr>
+      <w:r>
+        <w:rPr>
+          <w:b w:val="1"/>
+          <w:color w:val="1155cc"/>
+          <w:rtl w:val="0"/>
+        </w:rPr>
+        <w:t xml:space="preserve">conduit angle box two </w:t>
+      </w:r>
+      <w:r>
+        <w:rPr>
+          <w:b w:val="1"/>
+          <w:rtl w:val="0"/>
+        </w:rPr>
+        <w:t xml:space="preserve">side</w:t>
+      </w:r>
+      <w:r>
+        <w:rPr>
+          <w:rtl w:val="0"/>
+        </w:rPr>
+      </w:r>
+    </w:p>
+    <w:p>
+      <w:pPr>
+        <w:rPr>
+          <w:b w:val="1"/>
+          <w:color w:val="1155cc"/>
+          <w:u w:val="single"/>
+        </w:rPr>
+      </w:pPr>
+      <w:r>
+        <w:rPr>
+          <w:rtl w:val="0"/>
+        </w:rPr>
+      </w:r>
+    </w:p>
+    <w:p>
+      <w:pPr>
+        <w:rPr/>
+      </w:pPr>
+      <w:r>
+        <w:rPr>
+          <w:rtl w:val="0"/>
+        </w:rPr>
+        <w:t xml:space="preserve">This will give you a small gap between the </w:t>
+      </w:r>
+      <w:r>
+        <w:rPr>
+          <w:b w:val="1"/>
+          <w:color w:val="9900ff"/>
+          <w:rtl w:val="0"/>
+        </w:rPr>
+        <w:t xml:space="preserve">steel conduit</w:t>
+      </w:r>
+      <w:r>
+        <w:rPr>
+          <w:rtl w:val="0"/>
+        </w:rPr>
+        <w:t xml:space="preserve"> and the </w:t>
+      </w:r>
+      <w:r>
+        <w:rPr>
+          <w:b w:val="1"/>
+          <w:color w:val="ff9900"/>
+          <w:rtl w:val="0"/>
+        </w:rPr>
+        <w:t xml:space="preserve">nipple </w:t>
+      </w:r>
+      <w:r>
+        <w:rPr>
+          <w:rtl w:val="0"/>
+        </w:rPr>
+        <w:t xml:space="preserve">sticking out of </w:t>
+      </w:r>
+      <w:r>
+        <w:rPr>
+          <w:b w:val="1"/>
+          <w:color w:val="1155cc"/>
+          <w:rtl w:val="0"/>
+        </w:rPr>
+        <w:t xml:space="preserve">conduit angle box two</w:t>
+      </w:r>
+      <w:r>
+        <w:rPr>
+          <w:rtl w:val="0"/>
+        </w:rPr>
+        <w:t xml:space="preserve">.</w:t>
+      </w:r>
+    </w:p>
+    <w:p>
+      <w:pPr>
+        <w:rPr/>
+      </w:pPr>
+      <w:r>
+        <w:rPr>
+          <w:rtl w:val="0"/>
+        </w:rPr>
+      </w:r>
+    </w:p>
+    <w:p>
+      <w:pPr>
+        <w:rPr/>
+      </w:pPr>
+      <w:r>
+        <w:rPr>
+          <w:rtl w:val="0"/>
+        </w:rPr>
+        <w:t xml:space="preserve">With the</w:t>
+      </w:r>
+      <w:r>
+        <w:rPr>
+          <w:b w:val="1"/>
+          <w:color w:val="9900ff"/>
+          <w:rtl w:val="0"/>
+        </w:rPr>
+        <w:t xml:space="preserve"> steel conduit </w:t>
+      </w:r>
+      <w:r>
+        <w:rPr>
+          <w:rtl w:val="0"/>
+        </w:rPr>
+        <w:t xml:space="preserve">on the opposite end. The end near to </w:t>
+      </w:r>
+      <w:r>
+        <w:rPr>
+          <w:b w:val="1"/>
+          <w:color w:val="1155cc"/>
+          <w:rtl w:val="0"/>
+        </w:rPr>
+        <w:t xml:space="preserve">conduit angle box two</w:t>
+      </w:r>
+      <w:r>
+        <w:rPr>
+          <w:rtl w:val="0"/>
+        </w:rPr>
+        <w:t xml:space="preserve">. You need to apply sufficient external thread to the outside of the </w:t>
+      </w:r>
+      <w:r>
+        <w:rPr>
+          <w:b w:val="1"/>
+          <w:color w:val="9900ff"/>
+          <w:rtl w:val="0"/>
+        </w:rPr>
+        <w:t xml:space="preserve">steel conduit</w:t>
+      </w:r>
+      <w:r>
+        <w:rPr>
+          <w:rtl w:val="0"/>
+        </w:rPr>
+        <w:t xml:space="preserve">. This will allow you to screw/run/move the </w:t>
+      </w:r>
+      <w:r>
+        <w:rPr>
+          <w:b w:val="1"/>
+          <w:color w:val="6aa84f"/>
+          <w:rtl w:val="0"/>
+        </w:rPr>
+        <w:t xml:space="preserve">lock ring</w:t>
+      </w:r>
+      <w:r>
+        <w:rPr>
+          <w:rtl w:val="0"/>
+        </w:rPr>
+        <w:t xml:space="preserve"> and </w:t>
+      </w:r>
+      <w:r>
+        <w:rPr>
+          <w:b w:val="1"/>
+          <w:color w:val="a64d79"/>
+          <w:rtl w:val="0"/>
+        </w:rPr>
+        <w:t xml:space="preserve">coupler </w:t>
+      </w:r>
+      <w:r>
+        <w:rPr>
+          <w:rtl w:val="0"/>
+        </w:rPr>
+        <w:t xml:space="preserve">from the end of the </w:t>
+      </w:r>
+      <w:r>
+        <w:rPr>
+          <w:b w:val="1"/>
+          <w:color w:val="9900ff"/>
+          <w:rtl w:val="0"/>
+        </w:rPr>
+        <w:t xml:space="preserve">steel conduit </w:t>
+      </w:r>
+      <w:r>
+        <w:rPr>
+          <w:rtl w:val="0"/>
+        </w:rPr>
+        <w:t xml:space="preserve">onto the </w:t>
+      </w:r>
+      <w:r>
+        <w:rPr>
+          <w:b w:val="1"/>
+          <w:color w:val="ff9900"/>
+          <w:rtl w:val="0"/>
+        </w:rPr>
+        <w:t xml:space="preserve">nipple</w:t>
+      </w:r>
+      <w:r>
+        <w:rPr>
+          <w:rtl w:val="0"/>
+        </w:rPr>
+        <w:t xml:space="preserve">. So that the end result is that both the end of the </w:t>
+      </w:r>
+      <w:r>
+        <w:rPr>
+          <w:b w:val="1"/>
+          <w:color w:val="9900ff"/>
+          <w:rtl w:val="0"/>
+        </w:rPr>
+        <w:t xml:space="preserve">steel conduit</w:t>
+      </w:r>
+      <w:r>
+        <w:rPr>
+          <w:rtl w:val="0"/>
+        </w:rPr>
+        <w:t xml:space="preserve"> and the </w:t>
+      </w:r>
+      <w:r>
+        <w:rPr>
+          <w:b w:val="1"/>
+          <w:color w:val="ff9900"/>
+          <w:rtl w:val="0"/>
+        </w:rPr>
+        <w:t xml:space="preserve">nipple </w:t>
+      </w:r>
+      <w:r>
+        <w:rPr>
+          <w:rtl w:val="0"/>
+        </w:rPr>
+        <w:t xml:space="preserve">are underneath the </w:t>
+      </w:r>
+      <w:r>
+        <w:rPr>
+          <w:b w:val="1"/>
+          <w:color w:val="6aa84f"/>
+          <w:rtl w:val="0"/>
+        </w:rPr>
+        <w:t xml:space="preserve">lock ring</w:t>
+      </w:r>
+      <w:r>
+        <w:rPr>
+          <w:rtl w:val="0"/>
+        </w:rPr>
+        <w:t xml:space="preserve"> and </w:t>
+      </w:r>
+      <w:r>
+        <w:rPr>
+          <w:b w:val="1"/>
+          <w:color w:val="a64d79"/>
+          <w:rtl w:val="0"/>
+        </w:rPr>
+        <w:t xml:space="preserve">coupler</w:t>
+      </w:r>
+      <w:r>
+        <w:rPr>
+          <w:rtl w:val="0"/>
+        </w:rPr>
+        <w:t xml:space="preserve">. </w:t>
+        <w:br w:type="textWrapping"/>
+        <w:br w:type="textWrapping"/>
+        <w:t xml:space="preserve">The </w:t>
+      </w:r>
+      <w:r>
+        <w:rPr>
+          <w:b w:val="1"/>
+          <w:color w:val="f1c232"/>
+          <w:rtl w:val="0"/>
+        </w:rPr>
+        <w:t xml:space="preserve">yellow section</w:t>
+      </w:r>
+      <w:r>
+        <w:rPr>
+          <w:color w:val="f1c232"/>
+          <w:rtl w:val="0"/>
+        </w:rPr>
+        <w:t xml:space="preserve"> </w:t>
+      </w:r>
+      <w:r>
+        <w:rPr>
+          <w:rtl w:val="0"/>
+        </w:rPr>
+        <w:t xml:space="preserve">shows that you need to apply a thread to the end of the </w:t>
+      </w:r>
+      <w:r>
+        <w:rPr>
+          <w:b w:val="1"/>
+          <w:color w:val="9900ff"/>
+          <w:rtl w:val="0"/>
+        </w:rPr>
+        <w:t xml:space="preserve">steel conduit</w:t>
+      </w:r>
+      <w:r>
+        <w:rPr>
+          <w:rtl w:val="0"/>
+        </w:rPr>
+        <w:t xml:space="preserve"> to give you room to screw the </w:t>
+      </w:r>
+      <w:r>
+        <w:rPr>
+          <w:b w:val="1"/>
+          <w:color w:val="a64d79"/>
+          <w:rtl w:val="0"/>
+        </w:rPr>
+        <w:t xml:space="preserve">coupler </w:t>
+      </w:r>
+      <w:r>
+        <w:rPr>
+          <w:rtl w:val="0"/>
+        </w:rPr>
+        <w:t xml:space="preserve">and </w:t>
+      </w:r>
+      <w:r>
+        <w:rPr>
+          <w:b w:val="1"/>
+          <w:color w:val="6aa84f"/>
+          <w:rtl w:val="0"/>
+        </w:rPr>
+        <w:t xml:space="preserve">lock ring</w:t>
+      </w:r>
+      <w:r>
+        <w:rPr>
+          <w:rtl w:val="0"/>
+        </w:rPr>
+        <w:t xml:space="preserve"> onto the </w:t>
+      </w:r>
+      <w:r>
+        <w:rPr>
+          <w:b w:val="1"/>
+          <w:color w:val="ff9900"/>
+          <w:rtl w:val="0"/>
+        </w:rPr>
+        <w:t xml:space="preserve">nipple</w:t>
+      </w:r>
+      <w:r>
+        <w:rPr>
+          <w:rtl w:val="0"/>
+        </w:rPr>
+        <w:t xml:space="preserve">.</w:t>
+      </w:r>
+      <w:r>
+        <w:rPr>
+          <w:rtl w:val="0"/>
+        </w:rPr>
       </w:r>
     </w:p>
     <w:p>
@@ -1065,7 +2309,7 @@
         <w:pStyle w:val="Heading1"/>
         <w:rPr/>
       </w:pPr>
-      <w:bookmarkStart w:colFirst="0" w:colLast="0" w:name="_7dklnazgm8sy" w:id="5"/>
+      <w:bookmarkStart w:colFirst="0" w:colLast="0" w:name="_w9fjh3i82d" w:id="5"/>
       <w:bookmarkEnd w:id="5"/>
       <w:r>
         <w:rPr>
@@ -1246,7 +2490,7 @@
       </w:r>
     </w:p>
     <w:sectPr>
-      <w:headerReference r:id="rId11" w:type="default"/>
+      <w:headerReference r:id="rId14" w:type="default"/>
       <w:pgSz w:h="16834" w:w="11909" w:orient="portrait"/>
       <w:pgMar w:bottom="1440" w:top="1440" w:left="1440" w:right="1440" w:header="720" w:footer="720"/>
       <w:pgNumType w:start="1"/>
@@ -1283,7 +2527,121 @@
 </file>
 
 <file path=word/numbering.xml><?xml version="1.0" encoding="utf-8"?>
-<w:numbering xmlns:mc="http://schemas.openxmlformats.org/markup-compatibility/2006" xmlns:o="urn:schemas-microsoft-com:office:office" xmlns:r="http://schemas.openxmlformats.org/officeDocument/2006/relationships" xmlns:m="http://schemas.openxmlformats.org/officeDocument/2006/math" xmlns:v="urn:schemas-microsoft-com:vml" xmlns:wp="http://schemas.openxmlformats.org/drawingml/2006/wordprocessingDrawing" xmlns:w10="urn:schemas-microsoft-com:office:word" xmlns:w="http://schemas.openxmlformats.org/wordprocessingml/2006/main" xmlns:wne="http://schemas.microsoft.com/office/word/2006/wordml" xmlns:sl="http://schemas.openxmlformats.org/schemaLibrary/2006/main" xmlns:a="http://schemas.openxmlformats.org/drawingml/2006/main" xmlns:pic="http://schemas.openxmlformats.org/drawingml/2006/picture" xmlns:c="http://schemas.openxmlformats.org/drawingml/2006/chart" xmlns:lc="http://schemas.openxmlformats.org/drawingml/2006/lockedCanvas" xmlns:dgm="http://schemas.openxmlformats.org/drawingml/2006/diagram" xmlns:wps="http://schemas.microsoft.com/office/word/2010/wordprocessingShape" xmlns:wpg="http://schemas.microsoft.com/office/word/2010/wordprocessingGroup" xmlns:w14="http://schemas.microsoft.com/office/word/2010/wordml" xmlns:w15="http://schemas.microsoft.com/office/word/2012/wordml" xmlns:w16="http://schemas.microsoft.com/office/word/2018/wordml" xmlns:w16cex="http://schemas.microsoft.com/office/word/2018/wordml/cex" xmlns:w16cid="http://schemas.microsoft.com/office/word/2016/wordml/cid" xmlns="http://schemas.microsoft.com/office/tasks/2019/documenttasks" xmlns:cr="http://schemas.microsoft.com/office/comments/2020/reactions"/>
+<w:numbering xmlns:mc="http://schemas.openxmlformats.org/markup-compatibility/2006" xmlns:o="urn:schemas-microsoft-com:office:office" xmlns:r="http://schemas.openxmlformats.org/officeDocument/2006/relationships" xmlns:m="http://schemas.openxmlformats.org/officeDocument/2006/math" xmlns:v="urn:schemas-microsoft-com:vml" xmlns:wp="http://schemas.openxmlformats.org/drawingml/2006/wordprocessingDrawing" xmlns:w10="urn:schemas-microsoft-com:office:word" xmlns:w="http://schemas.openxmlformats.org/wordprocessingml/2006/main" xmlns:wne="http://schemas.microsoft.com/office/word/2006/wordml" xmlns:sl="http://schemas.openxmlformats.org/schemaLibrary/2006/main" xmlns:a="http://schemas.openxmlformats.org/drawingml/2006/main" xmlns:pic="http://schemas.openxmlformats.org/drawingml/2006/picture" xmlns:c="http://schemas.openxmlformats.org/drawingml/2006/chart" xmlns:lc="http://schemas.openxmlformats.org/drawingml/2006/lockedCanvas" xmlns:dgm="http://schemas.openxmlformats.org/drawingml/2006/diagram" xmlns:wps="http://schemas.microsoft.com/office/word/2010/wordprocessingShape" xmlns:wpg="http://schemas.microsoft.com/office/word/2010/wordprocessingGroup" xmlns:w14="http://schemas.microsoft.com/office/word/2010/wordml" xmlns:w15="http://schemas.microsoft.com/office/word/2012/wordml" xmlns:w16="http://schemas.microsoft.com/office/word/2018/wordml" xmlns:w16cex="http://schemas.microsoft.com/office/word/2018/wordml/cex" xmlns:w16cid="http://schemas.microsoft.com/office/word/2016/wordml/cid" xmlns="http://schemas.microsoft.com/office/tasks/2019/documenttasks" xmlns:cr="http://schemas.microsoft.com/office/comments/2020/reactions">
+  <w:abstractNum w:abstractNumId="1">
+    <w:lvl w:ilvl="0">
+      <w:start w:val="1"/>
+      <w:numFmt w:val="bullet"/>
+      <w:lvlText w:val="-"/>
+      <w:lvlJc w:val="left"/>
+      <w:pPr>
+        <w:ind w:left="720" w:hanging="360"/>
+      </w:pPr>
+      <w:rPr>
+        <w:u w:val="none"/>
+      </w:rPr>
+    </w:lvl>
+    <w:lvl w:ilvl="1">
+      <w:start w:val="1"/>
+      <w:numFmt w:val="bullet"/>
+      <w:lvlText w:val="-"/>
+      <w:lvlJc w:val="left"/>
+      <w:pPr>
+        <w:ind w:left="1440" w:hanging="360"/>
+      </w:pPr>
+      <w:rPr>
+        <w:u w:val="none"/>
+      </w:rPr>
+    </w:lvl>
+    <w:lvl w:ilvl="2">
+      <w:start w:val="1"/>
+      <w:numFmt w:val="bullet"/>
+      <w:lvlText w:val="-"/>
+      <w:lvlJc w:val="left"/>
+      <w:pPr>
+        <w:ind w:left="2160" w:hanging="360"/>
+      </w:pPr>
+      <w:rPr>
+        <w:u w:val="none"/>
+      </w:rPr>
+    </w:lvl>
+    <w:lvl w:ilvl="3">
+      <w:start w:val="1"/>
+      <w:numFmt w:val="bullet"/>
+      <w:lvlText w:val="-"/>
+      <w:lvlJc w:val="left"/>
+      <w:pPr>
+        <w:ind w:left="2880" w:hanging="360"/>
+      </w:pPr>
+      <w:rPr>
+        <w:u w:val="none"/>
+      </w:rPr>
+    </w:lvl>
+    <w:lvl w:ilvl="4">
+      <w:start w:val="1"/>
+      <w:numFmt w:val="bullet"/>
+      <w:lvlText w:val="-"/>
+      <w:lvlJc w:val="left"/>
+      <w:pPr>
+        <w:ind w:left="3600" w:hanging="360"/>
+      </w:pPr>
+      <w:rPr>
+        <w:u w:val="none"/>
+      </w:rPr>
+    </w:lvl>
+    <w:lvl w:ilvl="5">
+      <w:start w:val="1"/>
+      <w:numFmt w:val="bullet"/>
+      <w:lvlText w:val="-"/>
+      <w:lvlJc w:val="left"/>
+      <w:pPr>
+        <w:ind w:left="4320" w:hanging="360"/>
+      </w:pPr>
+      <w:rPr>
+        <w:u w:val="none"/>
+      </w:rPr>
+    </w:lvl>
+    <w:lvl w:ilvl="6">
+      <w:start w:val="1"/>
+      <w:numFmt w:val="bullet"/>
+      <w:lvlText w:val="-"/>
+      <w:lvlJc w:val="left"/>
+      <w:pPr>
+        <w:ind w:left="5040" w:hanging="360"/>
+      </w:pPr>
+      <w:rPr>
+        <w:u w:val="none"/>
+      </w:rPr>
+    </w:lvl>
+    <w:lvl w:ilvl="7">
+      <w:start w:val="1"/>
+      <w:numFmt w:val="bullet"/>
+      <w:lvlText w:val="-"/>
+      <w:lvlJc w:val="left"/>
+      <w:pPr>
+        <w:ind w:left="5760" w:hanging="360"/>
+      </w:pPr>
+      <w:rPr>
+        <w:u w:val="none"/>
+      </w:rPr>
+    </w:lvl>
+    <w:lvl w:ilvl="8">
+      <w:start w:val="1"/>
+      <w:numFmt w:val="bullet"/>
+      <w:lvlText w:val="-"/>
+      <w:lvlJc w:val="left"/>
+      <w:pPr>
+        <w:ind w:left="6480" w:hanging="360"/>
+      </w:pPr>
+      <w:rPr>
+        <w:u w:val="none"/>
+      </w:rPr>
+    </w:lvl>
+  </w:abstractNum>
+  <w:num w:numId="1">
+    <w:abstractNumId w:val="1"/>
+  </w:num>
+</w:numbering>
 </file>
 
 <file path=word/styles.xml><?xml version="1.0" encoding="utf-8"?>

</xml_diff>